<commit_message>
One page Liceo 7: embellecer layout y recomendar arreglo a empresa de bomba.
La recomendación pide corregir la automatización de la sala de bomba porque
anula el corte WES y el agua no se corta nunca.

Co-authored-by: anibaloperacionesWes <anibaloperacionesWes@users.noreply.github.com>
</commit_message>
<xml_diff>
--- a/reports/Providencia/Liceo7_evaluacion_llave_emergencia/OnePage_Liceo7_profesional_cliente.docx
+++ b/reports/Providencia/Liceo7_evaluacion_llave_emergencia/OnePage_Liceo7_profesional_cliente.docx
@@ -2,37 +2,72 @@
 <file path=word/document.xml><?xml version="1.0" encoding="utf-8"?>
 <w:document xmlns:wpc="http://schemas.microsoft.com/office/word/2010/wordprocessingCanvas" xmlns:mo="http://schemas.microsoft.com/office/mac/office/2008/main" xmlns:mc="http://schemas.openxmlformats.org/markup-compatibility/2006" xmlns:mv="urn:schemas-microsoft-com:mac:vml" xmlns:o="urn:schemas-microsoft-com:office:office" xmlns:r="http://schemas.openxmlformats.org/officeDocument/2006/relationships" xmlns:m="http://schemas.openxmlformats.org/officeDocument/2006/math" xmlns:v="urn:schemas-microsoft-com:vml" xmlns:wp14="http://schemas.microsoft.com/office/word/2010/wordprocessingDrawing" xmlns:wp="http://schemas.openxmlformats.org/drawingml/2006/wordprocessingDrawing" xmlns:w10="urn:schemas-microsoft-com:office:word" xmlns:w="http://schemas.openxmlformats.org/wordprocessingml/2006/main" xmlns:w14="http://schemas.microsoft.com/office/word/2010/wordml" xmlns:wpg="http://schemas.microsoft.com/office/word/2010/wordprocessingGroup" xmlns:wpi="http://schemas.microsoft.com/office/word/2010/wordprocessingInk" xmlns:wne="http://schemas.microsoft.com/office/word/2006/wordml" xmlns:wps="http://schemas.microsoft.com/office/word/2010/wordprocessingShape" mc:Ignorable="w14 wp14">
   <w:body>
+    <w:tbl>
+      <w:tblPr>
+        <w:tblW w:type="auto" w:w="0"/>
+        <w:tblLook w:firstColumn="1" w:firstRow="1" w:lastColumn="0" w:lastRow="0" w:noHBand="0" w:noVBand="1" w:val="04A0"/>
+      </w:tblPr>
+      <w:tblGrid>
+        <w:gridCol w:w="10596"/>
+      </w:tblGrid>
+      <w:tr>
+        <w:tc>
+          <w:tcPr>
+            <w:tcW w:type="dxa" w:w="10596"/>
+            <w:shd w:fill="1F5A96"/>
+            <w:tcMar>
+              <w:top w:w="70" w:type="dxa"/>
+              <w:left w:w="100" w:type="dxa"/>
+              <w:bottom w:w="55" w:type="dxa"/>
+              <w:right w:w="100" w:type="dxa"/>
+            </w:tcMar>
+            <w:tcBorders>
+              <w:top w:val="single" w:sz="12" w:space="0" w:color="1F5A96"/>
+              <w:left w:val="single" w:sz="12" w:space="0" w:color="1F5A96"/>
+              <w:bottom w:val="single" w:sz="12" w:space="0" w:color="1F5A96"/>
+              <w:right w:val="single" w:sz="12" w:space="0" w:color="1F5A96"/>
+            </w:tcBorders>
+          </w:tcPr>
+          <w:p>
+            <w:pPr>
+              <w:spacing w:before="0" w:after="20" w:line="252" w:lineRule="auto"/>
+              <w:jc w:val="center"/>
+            </w:pPr>
+            <w:r/>
+            <w:r>
+              <w:rPr>
+                <w:rFonts w:ascii="Calibri" w:hAnsi="Calibri" w:eastAsia="Calibri"/>
+                <w:b/>
+                <w:i w:val="0"/>
+                <w:color w:val="FFFFFF"/>
+                <w:sz w:val="27"/>
+              </w:rPr>
+              <w:t>Liceo 7 Luisa Saavedra — Providencia</w:t>
+            </w:r>
+          </w:p>
+          <w:p>
+            <w:pPr>
+              <w:spacing w:before="0" w:after="20" w:line="252" w:lineRule="auto"/>
+              <w:jc w:val="center"/>
+            </w:pPr>
+            <w:r>
+              <w:rPr>
+                <w:rFonts w:ascii="Calibri" w:hAnsi="Calibri" w:eastAsia="Calibri"/>
+                <w:b w:val="0"/>
+                <w:i w:val="0"/>
+                <w:color w:val="DBEAFE"/>
+                <w:sz w:val="16"/>
+              </w:rPr>
+              <w:t>Informe one page de consumo hídrico  ·  Sala de bomba  ·  Nodo WES 000006-04  ·  12/08/2026</w:t>
+            </w:r>
+          </w:p>
+        </w:tc>
+      </w:tr>
+    </w:tbl>
     <w:p>
       <w:pPr>
-        <w:spacing w:after="20" w:before="0" w:line="259" w:lineRule="auto"/>
-        <w:jc w:val="center"/>
+        <w:spacing w:after="80" w:before="0" w:line="259" w:lineRule="auto"/>
       </w:pPr>
-      <w:r>
-        <w:rPr>
-          <w:rFonts w:ascii="Calibri" w:hAnsi="Calibri" w:eastAsia="Calibri"/>
-          <w:b/>
-          <w:i w:val="0"/>
-          <w:color w:val="1F5A96"/>
-          <w:sz w:val="30"/>
-        </w:rPr>
-        <w:t>Informe one page — Liceo 7 Luisa Saavedra</w:t>
-      </w:r>
-    </w:p>
-    <w:p>
-      <w:pPr>
-        <w:spacing w:after="120" w:before="0" w:line="259" w:lineRule="auto"/>
-        <w:jc w:val="center"/>
-      </w:pPr>
-      <w:r>
-        <w:rPr>
-          <w:rFonts w:ascii="Calibri" w:hAnsi="Calibri" w:eastAsia="Calibri"/>
-          <w:b w:val="0"/>
-          <w:i w:val="0"/>
-          <w:color w:val="4B5563"/>
-          <w:sz w:val="17"/>
-        </w:rPr>
-        <w:t>Corporación de Educación de Providencia  ·  Sala de bomba  ·  Monitoreo WES 000006-04  ·  12 de agosto de 2026</w:t>
-      </w:r>
     </w:p>
     <w:p>
       <w:pPr>
@@ -44,14 +79,14 @@
           <w:b/>
           <w:i w:val="0"/>
           <w:color w:val="1F5A96"/>
-          <w:sz w:val="22"/>
+          <w:sz w:val="21"/>
         </w:rPr>
-        <w:t>¿Qué ocurrió?</w:t>
+        <w:t>Situación detectada</w:t>
       </w:r>
     </w:p>
     <w:p>
       <w:pPr>
-        <w:spacing w:after="100" w:before="0" w:line="259" w:lineRule="auto"/>
+        <w:spacing w:after="80" w:before="0" w:line="259" w:lineRule="auto"/>
       </w:pPr>
       <w:r>
         <w:rPr>
@@ -59,9 +94,9 @@
           <w:b w:val="0"/>
           <w:i w:val="0"/>
           <w:color w:val="1A1A1A"/>
-          <w:sz w:val="19"/>
+          <w:sz w:val="18"/>
         </w:rPr>
-        <w:t>Desde julio de 2026 la sala de bomba del establecimiento opera con el sistema WES, que ejecuta un corte hídrico programado cada noche entre las 23:00 y las 06:00. Ese control evita que el agua circule cuando el colegio no está en uso. El 7 de agosto el sistema de control fue desactivado. En la visita técnica del 12 de agosto se constató que la llave de emergencia está abierta: todo el caudal que el horario debería detener sigue pasando hacia la red interna.</w:t>
+        <w:t>Desde julio opera la sala de bomba con monitoreo WES y corte nocturno programado (23:00–06:00). El 7 de agosto el control WES quedó sin efecto operativo. En la visita técnica del 12/08 se encontró la llave de emergencia abierta: el agua que debería cortarse por horario sigue pasando. Además, la automatización de la empresa de la sala de bomba está tomando el control del sistema, por lo que el equipo WES no puede mantenerse activo ni ejecutar el corte: hoy el agua no se corta nunca.</w:t>
       </w:r>
     </w:p>
     <w:p>
@@ -72,7 +107,7 @@
       <w:r>
         <w:drawing>
           <wp:inline xmlns:a="http://schemas.openxmlformats.org/drawingml/2006/main" xmlns:pic="http://schemas.openxmlformats.org/drawingml/2006/picture">
-            <wp:extent cx="5989320" cy="2340068"/>
+            <wp:extent cx="6080760" cy="2212196"/>
             <wp:docPr id="1" name="Picture 1"/>
             <wp:cNvGraphicFramePr>
               <a:graphicFrameLocks noChangeAspect="1"/>
@@ -93,7 +128,7 @@
                   <pic:spPr>
                     <a:xfrm>
                       <a:off x="0" y="0"/>
-                      <a:ext cx="5989320" cy="2340068"/>
+                      <a:ext cx="6080760" cy="2212196"/>
                     </a:xfrm>
                     <a:prstGeom prst="rect"/>
                   </pic:spPr>
@@ -106,7 +141,7 @@
     </w:p>
     <w:p>
       <w:pPr>
-        <w:spacing w:after="120" w:before="0" w:line="259" w:lineRule="auto"/>
+        <w:spacing w:after="100" w:before="0" w:line="259" w:lineRule="auto"/>
       </w:pPr>
       <w:r>
         <w:rPr>
@@ -114,9 +149,9 @@
           <w:b w:val="0"/>
           <w:i/>
           <w:color w:val="4B5563"/>
-          <w:sz w:val="16"/>
+          <w:sz w:val="15"/>
         </w:rPr>
-        <w:t>Izquierda: con control la madrugada cae a ~0 m³/h; sin control el flujo nocturno se mantiene entre 9 y 19 m³/h. Derecha: desde el 7/08 el consumo diario sube y también aparece consumo alto en fin de semana.</w:t>
+        <w:t>Con control WES la madrugada cae a ~0 m³/h. Sin corte efectivo, el flujo nocturno se mantiene (9–19 m³/h) y el consumo diario —incluido el fin de semana— queda permanentemente elevado.</w:t>
       </w:r>
     </w:p>
     <w:p>
@@ -129,14 +164,14 @@
           <w:b/>
           <w:i w:val="0"/>
           <w:color w:val="1F5A96"/>
-          <w:sz w:val="22"/>
+          <w:sz w:val="21"/>
         </w:rPr>
-        <w:t>¿Qué significa para el colegio?</w:t>
+        <w:t>Qué significa para el establecimiento</w:t>
       </w:r>
     </w:p>
     <w:p>
       <w:pPr>
-        <w:spacing w:after="80" w:before="0" w:line="264" w:lineRule="auto"/>
+        <w:spacing w:after="100" w:before="0" w:line="269" w:lineRule="auto"/>
       </w:pPr>
       <w:r>
         <w:rPr>
@@ -144,9 +179,9 @@
           <w:b w:val="0"/>
           <w:i w:val="0"/>
           <w:color w:val="1A1A1A"/>
-          <w:sz w:val="19"/>
+          <w:sz w:val="18"/>
         </w:rPr>
-        <w:t xml:space="preserve">Con el control activo, un día hábil tipico consume cerca de </w:t>
+        <w:t xml:space="preserve">Un día hábil con control WES consume cerca de </w:t>
       </w:r>
       <w:r>
         <w:rPr>
@@ -154,7 +189,7 @@
           <w:b/>
           <w:i w:val="0"/>
           <w:color w:val="1F5A96"/>
-          <w:sz w:val="19"/>
+          <w:sz w:val="18"/>
         </w:rPr>
         <w:t>393 m³</w:t>
       </w:r>
@@ -164,9 +199,9 @@
           <w:b w:val="0"/>
           <w:i w:val="0"/>
           <w:color w:val="1A1A1A"/>
-          <w:sz w:val="19"/>
+          <w:sz w:val="18"/>
         </w:rPr>
-        <w:t xml:space="preserve">, y la madrugada queda prácticamente en cero. Desde la desactivación, el mismo tipo de día sube a </w:t>
+        <w:t xml:space="preserve">. Desde que el corte dejó de actuar, el mismo tipo de día sube a </w:t>
       </w:r>
       <w:r>
         <w:rPr>
@@ -174,9 +209,9 @@
           <w:b/>
           <w:i w:val="0"/>
           <w:color w:val="C0392B"/>
-          <w:sz w:val="19"/>
+          <w:sz w:val="18"/>
         </w:rPr>
-        <w:t>577 m³</w:t>
+        <w:t>577 m³ (+47%)</w:t>
       </w:r>
       <w:r>
         <w:rPr>
@@ -184,9 +219,9 @@
           <w:b w:val="0"/>
           <w:i w:val="0"/>
           <w:color w:val="1A1A1A"/>
-          <w:sz w:val="19"/>
+          <w:sz w:val="18"/>
         </w:rPr>
-        <w:t xml:space="preserve"> (+47%). Además, sábados y domingos —que antes quedaban en ~0— ahora marcan alrededor de </w:t>
+        <w:t xml:space="preserve">. Los fines de semana, que antes quedaban en ~0, ahora marcan alrededor de </w:t>
       </w:r>
       <w:r>
         <w:rPr>
@@ -194,7 +229,7 @@
           <w:b/>
           <w:i w:val="0"/>
           <w:color w:val="C0392B"/>
-          <w:sz w:val="19"/>
+          <w:sz w:val="18"/>
         </w:rPr>
         <w:t>407 m³/día</w:t>
       </w:r>
@@ -204,24 +239,9 @@
           <w:b w:val="0"/>
           <w:i w:val="0"/>
           <w:color w:val="1A1A1A"/>
-          <w:sz w:val="19"/>
+          <w:sz w:val="18"/>
         </w:rPr>
-        <w:t>, porque el corte de fin de semana también dejó de aplicarse.</w:t>
-      </w:r>
-    </w:p>
-    <w:p>
-      <w:pPr>
-        <w:spacing w:after="120" w:before="0" w:line="264" w:lineRule="auto"/>
-      </w:pPr>
-      <w:r>
-        <w:rPr>
-          <w:rFonts w:ascii="Calibri" w:hAnsi="Calibri" w:eastAsia="Calibri"/>
-          <w:b w:val="0"/>
-          <w:i w:val="0"/>
-          <w:color w:val="1A1A1A"/>
-          <w:sz w:val="19"/>
-        </w:rPr>
-        <w:t xml:space="preserve">En solo cinco días (7 al 11 de agosto) el exceso acumulado fue de aproximadamente </w:t>
+        <w:t xml:space="preserve">. En cinco días (7–11 ago) el exceso acumulado fue ≈ </w:t>
       </w:r>
       <w:r>
         <w:rPr>
@@ -229,7 +249,7 @@
           <w:b/>
           <w:i w:val="0"/>
           <w:color w:val="C0392B"/>
-          <w:sz w:val="19"/>
+          <w:sz w:val="18"/>
         </w:rPr>
         <w:t>1.370 m³</w:t>
       </w:r>
@@ -239,9 +259,9 @@
           <w:b w:val="0"/>
           <w:i w:val="0"/>
           <w:color w:val="1A1A1A"/>
-          <w:sz w:val="19"/>
+          <w:sz w:val="18"/>
         </w:rPr>
-        <w:t xml:space="preserve"> respecto al escenario con control. Esa agua no responde a mayor actividad pedagógica: es caudal que el horario de corte debería haber detenido.</w:t>
+        <w:t>: agua que el horario de corte debería haber detenido, no un aumento de uso pedagógico.</w:t>
       </w:r>
     </w:p>
     <w:p>
@@ -254,31 +274,42 @@
           <w:b/>
           <w:i w:val="0"/>
           <w:color w:val="1F5A96"/>
-          <w:sz w:val="22"/>
+          <w:sz w:val="21"/>
         </w:rPr>
-        <w:t>Proyección si no se corrige</w:t>
+        <w:t>Proyección mensual si se mantiene sin corte</w:t>
       </w:r>
     </w:p>
     <w:tbl>
       <w:tblPr>
-        <w:tblStyle w:val="TableGrid"/>
         <w:tblW w:type="auto" w:w="0"/>
         <w:tblLook w:firstColumn="1" w:firstRow="1" w:lastColumn="0" w:lastRow="0" w:noHBand="0" w:noVBand="1" w:val="04A0"/>
       </w:tblPr>
       <w:tblGrid>
-        <w:gridCol w:w="3494"/>
-        <w:gridCol w:w="3494"/>
-        <w:gridCol w:w="3494"/>
+        <w:gridCol w:w="3532"/>
+        <w:gridCol w:w="3532"/>
+        <w:gridCol w:w="3532"/>
       </w:tblGrid>
       <w:tr>
         <w:tc>
           <w:tcPr>
-            <w:tcW w:type="dxa" w:w="3494"/>
+            <w:tcW w:type="dxa" w:w="3532"/>
             <w:shd w:fill="1F5A96"/>
+            <w:tcMar>
+              <w:top w:w="55" w:type="dxa"/>
+              <w:left w:w="70" w:type="dxa"/>
+              <w:bottom w:w="45" w:type="dxa"/>
+              <w:right w:w="70" w:type="dxa"/>
+            </w:tcMar>
+            <w:tcBorders>
+              <w:top w:val="single" w:sz="12" w:space="0" w:color="1F5A96"/>
+              <w:left w:val="single" w:sz="12" w:space="0" w:color="1F5A96"/>
+              <w:bottom w:val="single" w:sz="12" w:space="0" w:color="1F5A96"/>
+              <w:right w:val="single" w:sz="12" w:space="0" w:color="1F5A96"/>
+            </w:tcBorders>
           </w:tcPr>
           <w:p>
             <w:pPr>
-              <w:spacing w:before="40" w:after="40"/>
+              <w:spacing w:before="0" w:after="20" w:line="252" w:lineRule="auto"/>
               <w:jc w:val="center"/>
             </w:pPr>
             <w:r/>
@@ -287,23 +318,67 @@
                 <w:rFonts w:ascii="Calibri" w:hAnsi="Calibri" w:eastAsia="Calibri"/>
                 <w:b/>
                 <w:i w:val="0"/>
+                <w:color w:val="DBEAFE"/>
+                <w:sz w:val="15"/>
+              </w:rPr>
+              <w:t>Con control WES</w:t>
+            </w:r>
+          </w:p>
+          <w:p>
+            <w:pPr>
+              <w:spacing w:before="0" w:after="20" w:line="252" w:lineRule="auto"/>
+              <w:jc w:val="center"/>
+            </w:pPr>
+            <w:r>
+              <w:rPr>
+                <w:rFonts w:ascii="Calibri" w:hAnsi="Calibri" w:eastAsia="Calibri"/>
+                <w:b/>
+                <w:i w:val="0"/>
                 <w:color w:val="FFFFFF"/>
-                <w:sz w:val="18"/>
+                <w:sz w:val="22"/>
               </w:rPr>
-              <w:t>Con control</w:t>
+              <w:t>≈ 8.600 m³/mes</w:t>
+            </w:r>
+          </w:p>
+          <w:p>
+            <w:pPr>
+              <w:spacing w:before="0" w:after="20" w:line="252" w:lineRule="auto"/>
+              <w:jc w:val="center"/>
+            </w:pPr>
+            <w:r>
+              <w:rPr>
+                <w:rFonts w:ascii="Calibri" w:hAnsi="Calibri" w:eastAsia="Calibri"/>
+                <w:b w:val="0"/>
+                <w:i w:val="0"/>
+                <w:color w:val="FEF2F2"/>
+                <w:sz w:val="14"/>
+              </w:rPr>
+              <w:t>Escenario normal</w:t>
               <w:br/>
-              <w:t>≈ 8.600 m³/mes</w:t>
+              <w:t>del colegio</w:t>
             </w:r>
           </w:p>
         </w:tc>
         <w:tc>
           <w:tcPr>
-            <w:tcW w:type="dxa" w:w="3494"/>
+            <w:tcW w:type="dxa" w:w="3532"/>
             <w:shd w:fill="C0392B"/>
+            <w:tcMar>
+              <w:top w:w="55" w:type="dxa"/>
+              <w:left w:w="70" w:type="dxa"/>
+              <w:bottom w:w="45" w:type="dxa"/>
+              <w:right w:w="70" w:type="dxa"/>
+            </w:tcMar>
+            <w:tcBorders>
+              <w:top w:val="single" w:sz="12" w:space="0" w:color="C0392B"/>
+              <w:left w:val="single" w:sz="12" w:space="0" w:color="C0392B"/>
+              <w:bottom w:val="single" w:sz="12" w:space="0" w:color="C0392B"/>
+              <w:right w:val="single" w:sz="12" w:space="0" w:color="C0392B"/>
+            </w:tcBorders>
           </w:tcPr>
           <w:p>
             <w:pPr>
-              <w:spacing w:before="40" w:after="40"/>
+              <w:spacing w:before="0" w:after="20" w:line="252" w:lineRule="auto"/>
               <w:jc w:val="center"/>
             </w:pPr>
             <w:r/>
@@ -312,85 +387,40 @@
                 <w:rFonts w:ascii="Calibri" w:hAnsi="Calibri" w:eastAsia="Calibri"/>
                 <w:b/>
                 <w:i w:val="0"/>
-                <w:color w:val="FFFFFF"/>
-                <w:sz w:val="18"/>
+                <w:color w:val="DBEAFE"/>
+                <w:sz w:val="15"/>
               </w:rPr>
-              <w:t>Sin control / llave abierta</w:t>
-              <w:br/>
-              <w:t>≈ 16.000 m³/mes</w:t>
+              <w:t>Sin corte efectivo</w:t>
             </w:r>
           </w:p>
-        </w:tc>
-        <w:tc>
-          <w:tcPr>
-            <w:tcW w:type="dxa" w:w="3494"/>
-            <w:shd w:fill="7F1D1D"/>
-          </w:tcPr>
           <w:p>
             <w:pPr>
-              <w:spacing w:before="40" w:after="40"/>
+              <w:spacing w:before="0" w:after="20" w:line="252" w:lineRule="auto"/>
               <w:jc w:val="center"/>
             </w:pPr>
-            <w:r/>
             <w:r>
               <w:rPr>
                 <w:rFonts w:ascii="Calibri" w:hAnsi="Calibri" w:eastAsia="Calibri"/>
                 <w:b/>
                 <w:i w:val="0"/>
                 <w:color w:val="FFFFFF"/>
-                <w:sz w:val="18"/>
+                <w:sz w:val="22"/>
               </w:rPr>
-              <w:t>Exceso estimado</w:t>
-              <w:br/>
-              <w:t>≈ 7.300 m³/mes  (~$10,2 M*)</w:t>
+              <w:t>≈ 16.000 m³/mes</w:t>
             </w:r>
           </w:p>
-        </w:tc>
-      </w:tr>
-      <w:tr>
-        <w:tc>
-          <w:tcPr>
-            <w:tcW w:type="dxa" w:w="3494"/>
-            <w:shd w:fill="F8FAFC"/>
-          </w:tcPr>
           <w:p>
             <w:pPr>
-              <w:spacing w:before="40" w:after="40"/>
+              <w:spacing w:before="0" w:after="20" w:line="252" w:lineRule="auto"/>
               <w:jc w:val="center"/>
             </w:pPr>
-            <w:r/>
             <w:r>
               <w:rPr>
                 <w:rFonts w:ascii="Calibri" w:hAnsi="Calibri" w:eastAsia="Calibri"/>
                 <w:b w:val="0"/>
                 <w:i w:val="0"/>
-                <w:color w:val="4B5563"/>
-                <w:sz w:val="15"/>
-              </w:rPr>
-              <w:t>Escenario operativo</w:t>
-              <w:br/>
-              <w:t>normal del colegio</w:t>
-            </w:r>
-          </w:p>
-        </w:tc>
-        <w:tc>
-          <w:tcPr>
-            <w:tcW w:type="dxa" w:w="3494"/>
-            <w:shd w:fill="FEF2F2"/>
-          </w:tcPr>
-          <w:p>
-            <w:pPr>
-              <w:spacing w:before="40" w:after="40"/>
-              <w:jc w:val="center"/>
-            </w:pPr>
-            <w:r/>
-            <w:r>
-              <w:rPr>
-                <w:rFonts w:ascii="Calibri" w:hAnsi="Calibri" w:eastAsia="Calibri"/>
-                <w:b w:val="0"/>
-                <w:i w:val="0"/>
-                <w:color w:val="4B5563"/>
-                <w:sz w:val="15"/>
+                <w:color w:val="FEF2F2"/>
+                <w:sz w:val="14"/>
               </w:rPr>
               <w:t>Tendencia actual</w:t>
               <w:br/>
@@ -400,26 +430,70 @@
         </w:tc>
         <w:tc>
           <w:tcPr>
-            <w:tcW w:type="dxa" w:w="3494"/>
-            <w:shd w:fill="FEF2F2"/>
+            <w:tcW w:type="dxa" w:w="3532"/>
+            <w:shd w:fill="7F1D1D"/>
+            <w:tcMar>
+              <w:top w:w="55" w:type="dxa"/>
+              <w:left w:w="70" w:type="dxa"/>
+              <w:bottom w:w="45" w:type="dxa"/>
+              <w:right w:w="70" w:type="dxa"/>
+            </w:tcMar>
+            <w:tcBorders>
+              <w:top w:val="single" w:sz="12" w:space="0" w:color="7F1D1D"/>
+              <w:left w:val="single" w:sz="12" w:space="0" w:color="7F1D1D"/>
+              <w:bottom w:val="single" w:sz="12" w:space="0" w:color="7F1D1D"/>
+              <w:right w:val="single" w:sz="12" w:space="0" w:color="7F1D1D"/>
+            </w:tcBorders>
           </w:tcPr>
           <w:p>
             <w:pPr>
-              <w:spacing w:before="40" w:after="40"/>
+              <w:spacing w:before="0" w:after="20" w:line="252" w:lineRule="auto"/>
               <w:jc w:val="center"/>
             </w:pPr>
             <w:r/>
             <w:r>
               <w:rPr>
                 <w:rFonts w:ascii="Calibri" w:hAnsi="Calibri" w:eastAsia="Calibri"/>
+                <w:b/>
+                <w:i w:val="0"/>
+                <w:color w:val="DBEAFE"/>
+                <w:sz w:val="15"/>
+              </w:rPr>
+              <w:t>Exceso evitable</w:t>
+            </w:r>
+          </w:p>
+          <w:p>
+            <w:pPr>
+              <w:spacing w:before="0" w:after="20" w:line="252" w:lineRule="auto"/>
+              <w:jc w:val="center"/>
+            </w:pPr>
+            <w:r>
+              <w:rPr>
+                <w:rFonts w:ascii="Calibri" w:hAnsi="Calibri" w:eastAsia="Calibri"/>
+                <w:b/>
+                <w:i w:val="0"/>
+                <w:color w:val="FFFFFF"/>
+                <w:sz w:val="22"/>
+              </w:rPr>
+              <w:t>≈ 7.300 m³/mes</w:t>
+            </w:r>
+          </w:p>
+          <w:p>
+            <w:pPr>
+              <w:spacing w:before="0" w:after="20" w:line="252" w:lineRule="auto"/>
+              <w:jc w:val="center"/>
+            </w:pPr>
+            <w:r>
+              <w:rPr>
+                <w:rFonts w:ascii="Calibri" w:hAnsi="Calibri" w:eastAsia="Calibri"/>
                 <w:b w:val="0"/>
                 <w:i w:val="0"/>
-                <w:color w:val="4B5563"/>
-                <w:sz w:val="15"/>
+                <w:color w:val="FEF2F2"/>
+                <w:sz w:val="14"/>
               </w:rPr>
-              <w:t>Agua evitable al</w:t>
+              <w:t>~$10,2 millones ref.*</w:t>
               <w:br/>
-              <w:t>restablecer el corte</w:t>
+              <w:t>al restablecer el corte</w:t>
             </w:r>
           </w:p>
         </w:tc>
@@ -435,9 +509,9 @@
           <w:b w:val="0"/>
           <w:i/>
           <w:color w:val="4B5563"/>
-          <w:sz w:val="15"/>
+          <w:sz w:val="14"/>
         </w:rPr>
-        <w:t>*Valorización referencial a $1.400/m³ (orientativa, no corresponde a factura). Extrapolación a 30 días (22 hábiles + 8 fin de semana) con el comportamiento observado.</w:t>
+        <w:t>*Tarifa referencial $1.400/m³ (orientativa, no factura). Extrapolación 22 hábiles + 8 fin de semana.</w:t>
       </w:r>
     </w:p>
     <w:p>
@@ -450,31 +524,57 @@
           <w:b/>
           <w:i w:val="0"/>
           <w:color w:val="1F5A96"/>
-          <w:sz w:val="22"/>
+          <w:sz w:val="21"/>
         </w:rPr>
         <w:t>Recomendación</w:t>
       </w:r>
     </w:p>
     <w:tbl>
       <w:tblPr>
-        <w:tblStyle w:val="TableGrid"/>
         <w:tblW w:type="auto" w:w="0"/>
         <w:tblLook w:firstColumn="1" w:firstRow="1" w:lastColumn="0" w:lastRow="0" w:noHBand="0" w:noVBand="1" w:val="04A0"/>
       </w:tblPr>
       <w:tblGrid>
-        <w:gridCol w:w="10482"/>
+        <w:gridCol w:w="10596"/>
       </w:tblGrid>
       <w:tr>
         <w:tc>
           <w:tcPr>
-            <w:tcW w:type="dxa" w:w="10482"/>
+            <w:tcW w:type="dxa" w:w="10596"/>
             <w:shd w:fill="EFF6FF"/>
+            <w:tcMar>
+              <w:top w:w="60" w:type="dxa"/>
+              <w:left w:w="100" w:type="dxa"/>
+              <w:bottom w:w="55" w:type="dxa"/>
+              <w:right w:w="100" w:type="dxa"/>
+            </w:tcMar>
+            <w:tcBorders>
+              <w:top w:val="single" w:sz="12" w:space="0" w:color="1F5A96"/>
+              <w:left w:val="single" w:sz="12" w:space="0" w:color="1F5A96"/>
+              <w:bottom w:val="single" w:sz="12" w:space="0" w:color="1F5A96"/>
+              <w:right w:val="single" w:sz="12" w:space="0" w:color="1F5A96"/>
+            </w:tcBorders>
           </w:tcPr>
           <w:p>
             <w:pPr>
-              <w:spacing w:before="40" w:after="40"/>
+              <w:spacing w:before="0" w:after="20" w:line="252" w:lineRule="auto"/>
             </w:pPr>
             <w:r/>
+            <w:r>
+              <w:rPr>
+                <w:rFonts w:ascii="Calibri" w:hAnsi="Calibri" w:eastAsia="Calibri"/>
+                <w:b/>
+                <w:i w:val="0"/>
+                <w:color w:val="1F5A96"/>
+                <w:sz w:val="18"/>
+              </w:rPr>
+              <w:t>Solicitar a la empresa de la sala de bomba que corrija la instalación y su automatización.</w:t>
+            </w:r>
+          </w:p>
+          <w:p>
+            <w:pPr>
+              <w:spacing w:before="0" w:after="20" w:line="252" w:lineRule="auto"/>
+            </w:pPr>
             <w:r>
               <w:rPr>
                 <w:rFonts w:ascii="Calibri" w:hAnsi="Calibri" w:eastAsia="Calibri"/>
@@ -483,14 +583,22 @@
                 <w:color w:val="1A1A1A"/>
                 <w:sz w:val="18"/>
               </w:rPr>
-              <w:t>1) Cerrar de inmediato la llave de emergencia.</w:t>
-              <w:br/>
-              <w:t>2) Reactivar el control hídrico en horario 23:00–06:00.</w:t>
-              <w:br/>
-              <w:t>3) Verificar la misma noche en WES que las horas 01:00 a 05:00 vuelvan a ≈ 0 m³/h.</w:t>
-              <w:br/>
-              <w:br/>
-              <w:t>Mientras la llave permanezca abierta, el colegio proyecta casi el doble de consumo mensual respecto al escenario con control nocturno activo.</w:t>
+              <w:t>Hoy están controlando automáticamente el sistema; por eso el equipo WES no puede quedar activo ni ejecutar el corte programado: el agua no se corta nunca. Mientras la llave de emergencia siga abierta / el bypass automático interfiera, el colegio proyecta casi el doble de consumo mensual.</w:t>
+            </w:r>
+          </w:p>
+          <w:p>
+            <w:pPr>
+              <w:spacing w:before="0" w:after="20" w:line="252" w:lineRule="auto"/>
+            </w:pPr>
+            <w:r>
+              <w:rPr>
+                <w:rFonts w:ascii="Calibri" w:hAnsi="Calibri" w:eastAsia="Calibri"/>
+                <w:b/>
+                <w:i w:val="0"/>
+                <w:color w:val="1A1A1A"/>
+                <w:sz w:val="18"/>
+              </w:rPr>
+              <w:t>Pedido concreto:  1) Cerrar y asegurar la llave de emergencia.  2) Ajustar la automatización de bomba para que no anule el corte WES.  3) Permitir reactivar WES en horario 23:00–06:00 y verificar la misma noche que 01:00–05:00 vuelvan a ≈ 0 m³/h.</w:t>
             </w:r>
           </w:p>
         </w:tc>
@@ -498,7 +606,7 @@
     </w:tbl>
     <w:p>
       <w:pPr>
-        <w:spacing w:after="0" w:before="120" w:line="259" w:lineRule="auto"/>
+        <w:spacing w:after="0" w:before="100" w:line="259" w:lineRule="auto"/>
         <w:jc w:val="center"/>
       </w:pPr>
       <w:r>
@@ -507,7 +615,7 @@
           <w:b w:val="0"/>
           <w:i w:val="0"/>
           <w:color w:val="4B5563"/>
-          <w:sz w:val="15"/>
+          <w:sz w:val="14"/>
         </w:rPr>
         <w:t>WES Chile  ·  Fuente: serie horaria API nodo 000006-04  ·  Julio 2026 (sala de bomba operativa): 5.006 m³</w:t>
       </w:r>
@@ -515,7 +623,7 @@
     <w:sectPr>
       <w:headerReference w:type="default" r:id="rId9"/>
       <w:pgSz w:w="12240" w:h="15840"/>
-      <w:pgMar w:top="652" w:right="879" w:bottom="539" w:left="879" w:header="720" w:footer="720" w:gutter="0"/>
+      <w:pgMar w:top="595" w:right="822" w:bottom="510" w:left="822" w:header="720" w:footer="720" w:gutter="0"/>
       <w:cols w:space="720"/>
       <w:docGrid w:linePitch="360"/>
     </w:sectPr>

</xml_diff>

<commit_message>
One page Liceo 7: textos más precisos y % de consumo extra destacado.
Destaca +47% por día hábil y +85% en proyección mensual (~7.300 m³).

Co-authored-by: anibaloperacionesWes <anibaloperacionesWes@users.noreply.github.com>
</commit_message>
<xml_diff>
--- a/reports/Providencia/Liceo7_evaluacion_llave_emergencia/OnePage_Liceo7_profesional_cliente.docx
+++ b/reports/Providencia/Liceo7_evaluacion_llave_emergencia/OnePage_Liceo7_profesional_cliente.docx
@@ -8,18 +8,18 @@
         <w:tblLook w:firstColumn="1" w:firstRow="1" w:lastColumn="0" w:lastRow="0" w:noHBand="0" w:noVBand="1" w:val="04A0"/>
       </w:tblPr>
       <w:tblGrid>
-        <w:gridCol w:w="10596"/>
+        <w:gridCol w:w="10652"/>
       </w:tblGrid>
       <w:tr>
         <w:tc>
           <w:tcPr>
-            <w:tcW w:type="dxa" w:w="10596"/>
+            <w:tcW w:type="dxa" w:w="10652"/>
             <w:shd w:fill="1F5A96"/>
             <w:tcMar>
-              <w:top w:w="70" w:type="dxa"/>
-              <w:left w:w="100" w:type="dxa"/>
-              <w:bottom w:w="55" w:type="dxa"/>
-              <w:right w:w="100" w:type="dxa"/>
+              <w:top w:w="60" w:type="dxa"/>
+              <w:left w:w="90" w:type="dxa"/>
+              <w:bottom w:w="45" w:type="dxa"/>
+              <w:right w:w="90" w:type="dxa"/>
             </w:tcMar>
             <w:tcBorders>
               <w:top w:val="single" w:sz="12" w:space="0" w:color="1F5A96"/>
@@ -40,7 +40,7 @@
                 <w:b/>
                 <w:i w:val="0"/>
                 <w:color w:val="FFFFFF"/>
-                <w:sz w:val="27"/>
+                <w:sz w:val="26"/>
               </w:rPr>
               <w:t>Liceo 7 Luisa Saavedra — Providencia</w:t>
             </w:r>
@@ -58,7 +58,158 @@
                 <w:color w:val="DBEAFE"/>
                 <w:sz w:val="16"/>
               </w:rPr>
-              <w:t>Informe one page de consumo hídrico  ·  Sala de bomba  ·  Nodo WES 000006-04  ·  12/08/2026</w:t>
+              <w:t>One page consumo hídrico  ·  Sala de bomba  ·  WES 000006-04  ·  12/08/2026</w:t>
+            </w:r>
+          </w:p>
+        </w:tc>
+      </w:tr>
+    </w:tbl>
+    <w:p>
+      <w:pPr>
+        <w:spacing w:after="60" w:before="0" w:line="259" w:lineRule="auto"/>
+      </w:pPr>
+    </w:p>
+    <w:tbl>
+      <w:tblPr>
+        <w:tblW w:type="auto" w:w="0"/>
+        <w:tblLook w:firstColumn="1" w:firstRow="1" w:lastColumn="0" w:lastRow="0" w:noHBand="0" w:noVBand="1" w:val="04A0"/>
+      </w:tblPr>
+      <w:tblGrid>
+        <w:gridCol w:w="5326"/>
+        <w:gridCol w:w="5326"/>
+      </w:tblGrid>
+      <w:tr>
+        <w:tc>
+          <w:tcPr>
+            <w:tcW w:type="dxa" w:w="5326"/>
+            <w:shd w:fill="C0392B"/>
+            <w:tcMar>
+              <w:top w:w="50" w:type="dxa"/>
+              <w:left w:w="70" w:type="dxa"/>
+              <w:bottom w:w="40" w:type="dxa"/>
+              <w:right w:w="70" w:type="dxa"/>
+            </w:tcMar>
+            <w:tcBorders>
+              <w:top w:val="single" w:sz="12" w:space="0" w:color="C0392B"/>
+              <w:left w:val="single" w:sz="12" w:space="0" w:color="C0392B"/>
+              <w:bottom w:val="single" w:sz="12" w:space="0" w:color="C0392B"/>
+              <w:right w:val="single" w:sz="12" w:space="0" w:color="C0392B"/>
+            </w:tcBorders>
+          </w:tcPr>
+          <w:p>
+            <w:pPr>
+              <w:spacing w:before="0" w:after="20" w:line="252" w:lineRule="auto"/>
+              <w:jc w:val="center"/>
+            </w:pPr>
+            <w:r/>
+            <w:r>
+              <w:rPr>
+                <w:rFonts w:ascii="Calibri" w:hAnsi="Calibri" w:eastAsia="Calibri"/>
+                <w:b/>
+                <w:i w:val="0"/>
+                <w:color w:val="FEF2F2"/>
+                <w:sz w:val="15"/>
+              </w:rPr>
+              <w:t>CONSUMO EXTRA MEDIDO</w:t>
+            </w:r>
+          </w:p>
+          <w:p>
+            <w:pPr>
+              <w:spacing w:before="0" w:after="20" w:line="252" w:lineRule="auto"/>
+              <w:jc w:val="center"/>
+            </w:pPr>
+            <w:r>
+              <w:rPr>
+                <w:rFonts w:ascii="Calibri" w:hAnsi="Calibri" w:eastAsia="Calibri"/>
+                <w:b/>
+                <w:i w:val="0"/>
+                <w:color w:val="FFFFFF"/>
+                <w:sz w:val="44"/>
+              </w:rPr>
+              <w:t>+47%</w:t>
+            </w:r>
+          </w:p>
+          <w:p>
+            <w:pPr>
+              <w:spacing w:before="0" w:after="20" w:line="252" w:lineRule="auto"/>
+              <w:jc w:val="center"/>
+            </w:pPr>
+            <w:r>
+              <w:rPr>
+                <w:rFonts w:ascii="Calibri" w:hAnsi="Calibri" w:eastAsia="Calibri"/>
+                <w:b w:val="0"/>
+                <w:i w:val="0"/>
+                <w:color w:val="FEF2F2"/>
+                <w:sz w:val="16"/>
+              </w:rPr>
+              <w:t>por día hábil (393 → 577 m³)</w:t>
+            </w:r>
+          </w:p>
+        </w:tc>
+        <w:tc>
+          <w:tcPr>
+            <w:tcW w:type="dxa" w:w="5326"/>
+            <w:shd w:fill="7F1D1D"/>
+            <w:tcMar>
+              <w:top w:w="50" w:type="dxa"/>
+              <w:left w:w="70" w:type="dxa"/>
+              <w:bottom w:w="40" w:type="dxa"/>
+              <w:right w:w="70" w:type="dxa"/>
+            </w:tcMar>
+            <w:tcBorders>
+              <w:top w:val="single" w:sz="12" w:space="0" w:color="7F1D1D"/>
+              <w:left w:val="single" w:sz="12" w:space="0" w:color="7F1D1D"/>
+              <w:bottom w:val="single" w:sz="12" w:space="0" w:color="7F1D1D"/>
+              <w:right w:val="single" w:sz="12" w:space="0" w:color="7F1D1D"/>
+            </w:tcBorders>
+          </w:tcPr>
+          <w:p>
+            <w:pPr>
+              <w:spacing w:before="0" w:after="20" w:line="252" w:lineRule="auto"/>
+              <w:jc w:val="center"/>
+            </w:pPr>
+            <w:r/>
+            <w:r>
+              <w:rPr>
+                <w:rFonts w:ascii="Calibri" w:hAnsi="Calibri" w:eastAsia="Calibri"/>
+                <w:b/>
+                <w:i w:val="0"/>
+                <w:color w:val="FEF2F2"/>
+                <w:sz w:val="15"/>
+              </w:rPr>
+              <w:t>PROYECCIÓN MENSUAL DE EXCESO</w:t>
+            </w:r>
+          </w:p>
+          <w:p>
+            <w:pPr>
+              <w:spacing w:before="0" w:after="20" w:line="252" w:lineRule="auto"/>
+              <w:jc w:val="center"/>
+            </w:pPr>
+            <w:r>
+              <w:rPr>
+                <w:rFonts w:ascii="Calibri" w:hAnsi="Calibri" w:eastAsia="Calibri"/>
+                <w:b/>
+                <w:i w:val="0"/>
+                <w:color w:val="FFFFFF"/>
+                <w:sz w:val="44"/>
+              </w:rPr>
+              <w:t>+85%</w:t>
+            </w:r>
+          </w:p>
+          <w:p>
+            <w:pPr>
+              <w:spacing w:before="0" w:after="20" w:line="252" w:lineRule="auto"/>
+              <w:jc w:val="center"/>
+            </w:pPr>
+            <w:r>
+              <w:rPr>
+                <w:rFonts w:ascii="Calibri" w:hAnsi="Calibri" w:eastAsia="Calibri"/>
+                <w:b w:val="0"/>
+                <w:i w:val="0"/>
+                <w:color w:val="FEF2F2"/>
+                <w:sz w:val="16"/>
+              </w:rPr>
+              <w:t>≈ 7.315 m³/mes evitables (~$10.2 M*)</w:t>
             </w:r>
           </w:p>
         </w:tc>
@@ -81,7 +232,7 @@
           <w:color w:val="1F5A96"/>
           <w:sz w:val="21"/>
         </w:rPr>
-        <w:t>Situación detectada</w:t>
+        <w:t>Situación</w:t>
       </w:r>
     </w:p>
     <w:p>
@@ -96,7 +247,7 @@
           <w:color w:val="1A1A1A"/>
           <w:sz w:val="18"/>
         </w:rPr>
-        <w:t>Desde julio opera la sala de bomba con monitoreo WES y corte nocturno programado (23:00–06:00). El 7 de agosto el control WES quedó sin efecto operativo. En la visita técnica del 12/08 se encontró la llave de emergencia abierta: el agua que debería cortarse por horario sigue pasando. Además, la automatización de la empresa de la sala de bomba está tomando el control del sistema, por lo que el equipo WES no puede mantenerse activo ni ejecutar el corte: hoy el agua no se corta nunca.</w:t>
+        <w:t>La sala de bomba opera desde julio con corte WES programado 23:00–06:00. Desde el 7/08 ese corte dejó de ejecutarse. El 12/08 se verificó la llave de emergencia abierta. La automatización de la empresa de la sala de bomba está tomando el control del sistema; por eso el equipo WES no puede mantenerse activo ni cortar el agua: hoy el caudal nocturno no se detiene.</w:t>
       </w:r>
     </w:p>
     <w:p>
@@ -107,7 +258,7 @@
       <w:r>
         <w:drawing>
           <wp:inline xmlns:a="http://schemas.openxmlformats.org/drawingml/2006/main" xmlns:pic="http://schemas.openxmlformats.org/drawingml/2006/picture">
-            <wp:extent cx="6080760" cy="2212196"/>
+            <wp:extent cx="6126480" cy="2135494"/>
             <wp:docPr id="1" name="Picture 1"/>
             <wp:cNvGraphicFramePr>
               <a:graphicFrameLocks noChangeAspect="1"/>
@@ -128,7 +279,7 @@
                   <pic:spPr>
                     <a:xfrm>
                       <a:off x="0" y="0"/>
-                      <a:ext cx="6080760" cy="2212196"/>
+                      <a:ext cx="6126480" cy="2135494"/>
                     </a:xfrm>
                     <a:prstGeom prst="rect"/>
                   </pic:spPr>
@@ -141,7 +292,7 @@
     </w:p>
     <w:p>
       <w:pPr>
-        <w:spacing w:after="100" w:before="0" w:line="259" w:lineRule="auto"/>
+        <w:spacing w:after="80" w:before="0" w:line="259" w:lineRule="auto"/>
       </w:pPr>
       <w:r>
         <w:rPr>
@@ -151,7 +302,7 @@
           <w:color w:val="4B5563"/>
           <w:sz w:val="15"/>
         </w:rPr>
-        <w:t>Con control WES la madrugada cae a ~0 m³/h. Sin corte efectivo, el flujo nocturno se mantiene (9–19 m³/h) y el consumo diario —incluido el fin de semana— queda permanentemente elevado.</w:t>
+        <w:t>Con control, 01:00–05:00 ≈ 0 m³/h. Sin corte efectivo: 9–19 m³/h en madrugada y consumo alto también sábado/domingo.</w:t>
       </w:r>
     </w:p>
     <w:p>
@@ -166,32 +317,22 @@
           <w:color w:val="1F5A96"/>
           <w:sz w:val="21"/>
         </w:rPr>
-        <w:t>Qué significa para el establecimiento</w:t>
+        <w:t>Impacto medido (3–11 agosto)</w:t>
       </w:r>
     </w:p>
     <w:p>
       <w:pPr>
-        <w:spacing w:after="100" w:before="0" w:line="269" w:lineRule="auto"/>
+        <w:spacing w:after="80" w:before="0" w:line="269" w:lineRule="auto"/>
       </w:pPr>
-      <w:r>
-        <w:rPr>
-          <w:rFonts w:ascii="Calibri" w:hAnsi="Calibri" w:eastAsia="Calibri"/>
-          <w:b w:val="0"/>
-          <w:i w:val="0"/>
-          <w:color w:val="1A1A1A"/>
-          <w:sz w:val="18"/>
-        </w:rPr>
-        <w:t xml:space="preserve">Un día hábil con control WES consume cerca de </w:t>
-      </w:r>
       <w:r>
         <w:rPr>
           <w:rFonts w:ascii="Calibri" w:hAnsi="Calibri" w:eastAsia="Calibri"/>
           <w:b/>
           <w:i w:val="0"/>
-          <w:color w:val="1F5A96"/>
+          <w:color w:val="1A1A1A"/>
           <w:sz w:val="18"/>
         </w:rPr>
-        <w:t>393 m³</w:t>
+        <w:t xml:space="preserve">Día hábil: </w:t>
       </w:r>
       <w:r>
         <w:rPr>
@@ -201,7 +342,7 @@
           <w:color w:val="1A1A1A"/>
           <w:sz w:val="18"/>
         </w:rPr>
-        <w:t xml:space="preserve">. Desde que el corte dejó de actuar, el mismo tipo de día sube a </w:t>
+        <w:t>393 m³ con control → 577 m³ sin corte (</w:t>
       </w:r>
       <w:r>
         <w:rPr>
@@ -211,7 +352,7 @@
           <w:color w:val="C0392B"/>
           <w:sz w:val="18"/>
         </w:rPr>
-        <w:t>577 m³ (+47%)</w:t>
+        <w:t>+47%</w:t>
       </w:r>
       <w:r>
         <w:rPr>
@@ -221,7 +362,77 @@
           <w:color w:val="1A1A1A"/>
           <w:sz w:val="18"/>
         </w:rPr>
-        <w:t xml:space="preserve">. Los fines de semana, que antes quedaban en ~0, ahora marcan alrededor de </w:t>
+        <w:t xml:space="preserve">).  </w:t>
+      </w:r>
+      <w:r>
+        <w:rPr>
+          <w:rFonts w:ascii="Calibri" w:hAnsi="Calibri" w:eastAsia="Calibri"/>
+          <w:b/>
+          <w:i w:val="0"/>
+          <w:color w:val="1A1A1A"/>
+          <w:sz w:val="18"/>
+        </w:rPr>
+        <w:t xml:space="preserve">Noche 23–06: </w:t>
+      </w:r>
+      <w:r>
+        <w:rPr>
+          <w:rFonts w:ascii="Calibri" w:hAnsi="Calibri" w:eastAsia="Calibri"/>
+          <w:b w:val="0"/>
+          <w:i w:val="0"/>
+          <w:color w:val="1A1A1A"/>
+          <w:sz w:val="18"/>
+        </w:rPr>
+        <w:t xml:space="preserve">40 → 107 m³.  </w:t>
+      </w:r>
+      <w:r>
+        <w:rPr>
+          <w:rFonts w:ascii="Calibri" w:hAnsi="Calibri" w:eastAsia="Calibri"/>
+          <w:b/>
+          <w:i w:val="0"/>
+          <w:color w:val="1A1A1A"/>
+          <w:sz w:val="18"/>
+        </w:rPr>
+        <w:t xml:space="preserve">Madrugada 01–05: </w:t>
+      </w:r>
+      <w:r>
+        <w:rPr>
+          <w:rFonts w:ascii="Calibri" w:hAnsi="Calibri" w:eastAsia="Calibri"/>
+          <w:b w:val="0"/>
+          <w:i w:val="0"/>
+          <w:color w:val="1A1A1A"/>
+          <w:sz w:val="18"/>
+        </w:rPr>
+        <w:t xml:space="preserve">≈0 → 65 m³ (debería permanecer en cero).  </w:t>
+      </w:r>
+      <w:r>
+        <w:rPr>
+          <w:rFonts w:ascii="Calibri" w:hAnsi="Calibri" w:eastAsia="Calibri"/>
+          <w:b/>
+          <w:i w:val="0"/>
+          <w:color w:val="1A1A1A"/>
+          <w:sz w:val="18"/>
+        </w:rPr>
+        <w:t xml:space="preserve">Fin de semana: </w:t>
+      </w:r>
+      <w:r>
+        <w:rPr>
+          <w:rFonts w:ascii="Calibri" w:hAnsi="Calibri" w:eastAsia="Calibri"/>
+          <w:b w:val="0"/>
+          <w:i w:val="0"/>
+          <w:color w:val="1A1A1A"/>
+          <w:sz w:val="18"/>
+        </w:rPr>
+        <w:t xml:space="preserve">≈0 → 406 m³/día.  </w:t>
+      </w:r>
+      <w:r>
+        <w:rPr>
+          <w:rFonts w:ascii="Calibri" w:hAnsi="Calibri" w:eastAsia="Calibri"/>
+          <w:b/>
+          <w:i w:val="0"/>
+          <w:color w:val="1A1A1A"/>
+          <w:sz w:val="18"/>
+        </w:rPr>
+        <w:t xml:space="preserve">Exceso acumulado 7–11 ago: </w:t>
       </w:r>
       <w:r>
         <w:rPr>
@@ -231,7 +442,7 @@
           <w:color w:val="C0392B"/>
           <w:sz w:val="18"/>
         </w:rPr>
-        <w:t>407 m³/día</w:t>
+        <w:t>≈ 1.367 m³</w:t>
       </w:r>
       <w:r>
         <w:rPr>
@@ -241,27 +452,7 @@
           <w:color w:val="1A1A1A"/>
           <w:sz w:val="18"/>
         </w:rPr>
-        <w:t xml:space="preserve">. En cinco días (7–11 ago) el exceso acumulado fue ≈ </w:t>
-      </w:r>
-      <w:r>
-        <w:rPr>
-          <w:rFonts w:ascii="Calibri" w:hAnsi="Calibri" w:eastAsia="Calibri"/>
-          <w:b/>
-          <w:i w:val="0"/>
-          <w:color w:val="C0392B"/>
-          <w:sz w:val="18"/>
-        </w:rPr>
-        <w:t>1.370 m³</w:t>
-      </w:r>
-      <w:r>
-        <w:rPr>
-          <w:rFonts w:ascii="Calibri" w:hAnsi="Calibri" w:eastAsia="Calibri"/>
-          <w:b w:val="0"/>
-          <w:i w:val="0"/>
-          <w:color w:val="1A1A1A"/>
-          <w:sz w:val="18"/>
-        </w:rPr>
-        <w:t>: agua que el horario de corte debería haber detenido, no un aumento de uso pedagógico.</w:t>
+        <w:t>.</w:t>
       </w:r>
     </w:p>
     <w:p>
@@ -276,7 +467,7 @@
           <w:color w:val="1F5A96"/>
           <w:sz w:val="21"/>
         </w:rPr>
-        <w:t>Proyección mensual si se mantiene sin corte</w:t>
+        <w:t>Proyección a 30 días (22 hábiles + 8 fin de semana)</w:t>
       </w:r>
     </w:p>
     <w:tbl>
@@ -285,20 +476,20 @@
         <w:tblLook w:firstColumn="1" w:firstRow="1" w:lastColumn="0" w:lastRow="0" w:noHBand="0" w:noVBand="1" w:val="04A0"/>
       </w:tblPr>
       <w:tblGrid>
-        <w:gridCol w:w="3532"/>
-        <w:gridCol w:w="3532"/>
-        <w:gridCol w:w="3532"/>
+        <w:gridCol w:w="3551"/>
+        <w:gridCol w:w="3551"/>
+        <w:gridCol w:w="3551"/>
       </w:tblGrid>
       <w:tr>
         <w:tc>
           <w:tcPr>
-            <w:tcW w:type="dxa" w:w="3532"/>
+            <w:tcW w:type="dxa" w:w="3551"/>
             <w:shd w:fill="1F5A96"/>
             <w:tcMar>
-              <w:top w:w="55" w:type="dxa"/>
-              <w:left w:w="70" w:type="dxa"/>
-              <w:bottom w:w="45" w:type="dxa"/>
-              <w:right w:w="70" w:type="dxa"/>
+              <w:top w:w="48" w:type="dxa"/>
+              <w:left w:w="60" w:type="dxa"/>
+              <w:bottom w:w="40" w:type="dxa"/>
+              <w:right w:w="60" w:type="dxa"/>
             </w:tcMar>
             <w:tcBorders>
               <w:top w:val="single" w:sz="12" w:space="0" w:color="1F5A96"/>
@@ -337,7 +528,7 @@
                 <w:color w:val="FFFFFF"/>
                 <w:sz w:val="22"/>
               </w:rPr>
-              <w:t>≈ 8.600 m³/mes</w:t>
+              <w:t>≈ 8.637 m³/mes</w:t>
             </w:r>
           </w:p>
           <w:p>
@@ -353,21 +544,19 @@
                 <w:color w:val="FEF2F2"/>
                 <w:sz w:val="14"/>
               </w:rPr>
-              <w:t>Escenario normal</w:t>
-              <w:br/>
-              <w:t>del colegio</w:t>
+              <w:t>Base operativa</w:t>
             </w:r>
           </w:p>
         </w:tc>
         <w:tc>
           <w:tcPr>
-            <w:tcW w:type="dxa" w:w="3532"/>
+            <w:tcW w:type="dxa" w:w="3551"/>
             <w:shd w:fill="C0392B"/>
             <w:tcMar>
-              <w:top w:w="55" w:type="dxa"/>
-              <w:left w:w="70" w:type="dxa"/>
-              <w:bottom w:w="45" w:type="dxa"/>
-              <w:right w:w="70" w:type="dxa"/>
+              <w:top w:w="48" w:type="dxa"/>
+              <w:left w:w="60" w:type="dxa"/>
+              <w:bottom w:w="40" w:type="dxa"/>
+              <w:right w:w="60" w:type="dxa"/>
             </w:tcMar>
             <w:tcBorders>
               <w:top w:val="single" w:sz="12" w:space="0" w:color="C0392B"/>
@@ -406,7 +595,7 @@
                 <w:color w:val="FFFFFF"/>
                 <w:sz w:val="22"/>
               </w:rPr>
-              <w:t>≈ 16.000 m³/mes</w:t>
+              <w:t>≈ 15.952 m³/mes</w:t>
             </w:r>
           </w:p>
           <w:p>
@@ -423,20 +612,18 @@
                 <w:sz w:val="14"/>
               </w:rPr>
               <w:t>Tendencia actual</w:t>
-              <w:br/>
-              <w:t>medida 7–11 ago</w:t>
             </w:r>
           </w:p>
         </w:tc>
         <w:tc>
           <w:tcPr>
-            <w:tcW w:type="dxa" w:w="3532"/>
+            <w:tcW w:type="dxa" w:w="3551"/>
             <w:shd w:fill="7F1D1D"/>
             <w:tcMar>
-              <w:top w:w="55" w:type="dxa"/>
-              <w:left w:w="70" w:type="dxa"/>
-              <w:bottom w:w="45" w:type="dxa"/>
-              <w:right w:w="70" w:type="dxa"/>
+              <w:top w:w="48" w:type="dxa"/>
+              <w:left w:w="60" w:type="dxa"/>
+              <w:bottom w:w="40" w:type="dxa"/>
+              <w:right w:w="60" w:type="dxa"/>
             </w:tcMar>
             <w:tcBorders>
               <w:top w:val="single" w:sz="12" w:space="0" w:color="7F1D1D"/>
@@ -459,7 +646,7 @@
                 <w:color w:val="DBEAFE"/>
                 <w:sz w:val="15"/>
               </w:rPr>
-              <w:t>Exceso evitable</w:t>
+              <w:t>Exceso +85%</w:t>
             </w:r>
           </w:p>
           <w:p>
@@ -475,7 +662,7 @@
                 <w:color w:val="FFFFFF"/>
                 <w:sz w:val="22"/>
               </w:rPr>
-              <w:t>≈ 7.300 m³/mes</w:t>
+              <w:t>≈ 7.315 m³/mes</w:t>
             </w:r>
           </w:p>
           <w:p>
@@ -491,9 +678,7 @@
                 <w:color w:val="FEF2F2"/>
                 <w:sz w:val="14"/>
               </w:rPr>
-              <w:t>~$10,2 millones ref.*</w:t>
-              <w:br/>
-              <w:t>al restablecer el corte</w:t>
+              <w:t>~$10,2 M referenciales*</w:t>
             </w:r>
           </w:p>
         </w:tc>
@@ -501,7 +686,7 @@
     </w:tbl>
     <w:p>
       <w:pPr>
-        <w:spacing w:after="100" w:before="60" w:line="259" w:lineRule="auto"/>
+        <w:spacing w:after="80" w:before="40" w:line="259" w:lineRule="auto"/>
       </w:pPr>
       <w:r>
         <w:rPr>
@@ -511,7 +696,7 @@
           <w:color w:val="4B5563"/>
           <w:sz w:val="14"/>
         </w:rPr>
-        <w:t>*Tarifa referencial $1.400/m³ (orientativa, no factura). Extrapolación 22 hábiles + 8 fin de semana.</w:t>
+        <w:t>*Tarifa referencial $1.400/m³ (orientativa, no factura).</w:t>
       </w:r>
     </w:p>
     <w:p>
@@ -535,18 +720,18 @@
         <w:tblLook w:firstColumn="1" w:firstRow="1" w:lastColumn="0" w:lastRow="0" w:noHBand="0" w:noVBand="1" w:val="04A0"/>
       </w:tblPr>
       <w:tblGrid>
-        <w:gridCol w:w="10596"/>
+        <w:gridCol w:w="10652"/>
       </w:tblGrid>
       <w:tr>
         <w:tc>
           <w:tcPr>
-            <w:tcW w:type="dxa" w:w="10596"/>
+            <w:tcW w:type="dxa" w:w="10652"/>
             <w:shd w:fill="EFF6FF"/>
             <w:tcMar>
-              <w:top w:w="60" w:type="dxa"/>
-              <w:left w:w="100" w:type="dxa"/>
-              <w:bottom w:w="55" w:type="dxa"/>
-              <w:right w:w="100" w:type="dxa"/>
+              <w:top w:w="50" w:type="dxa"/>
+              <w:left w:w="90" w:type="dxa"/>
+              <w:bottom w:w="45" w:type="dxa"/>
+              <w:right w:w="90" w:type="dxa"/>
             </w:tcMar>
             <w:tcBorders>
               <w:top w:val="single" w:sz="12" w:space="0" w:color="1F5A96"/>
@@ -568,7 +753,7 @@
                 <w:color w:val="1F5A96"/>
                 <w:sz w:val="18"/>
               </w:rPr>
-              <w:t>Solicitar a la empresa de la sala de bomba que corrija la instalación y su automatización.</w:t>
+              <w:t>Pedir a la empresa de la sala de bomba que corrija la instalación y su automatización.</w:t>
             </w:r>
           </w:p>
           <w:p>
@@ -581,9 +766,9 @@
                 <w:b w:val="0"/>
                 <w:i w:val="0"/>
                 <w:color w:val="1A1A1A"/>
-                <w:sz w:val="18"/>
+                <w:sz w:val="17"/>
               </w:rPr>
-              <w:t>Hoy están controlando automáticamente el sistema; por eso el equipo WES no puede quedar activo ni ejecutar el corte programado: el agua no se corta nunca. Mientras la llave de emergencia siga abierta / el bypass automático interfiera, el colegio proyecta casi el doble de consumo mensual.</w:t>
+              <w:t>Hoy controlan automáticamente el sistema; por eso WES no puede quedar activo ni ejecutar el corte: el agua no se corta nunca. Mientras eso no se resuelva, el colegio proyecta un consumo mensual aproximadamente 85% mayor al escenario con control.</w:t>
             </w:r>
           </w:p>
           <w:p>
@@ -596,9 +781,9 @@
                 <w:b/>
                 <w:i w:val="0"/>
                 <w:color w:val="1A1A1A"/>
-                <w:sz w:val="18"/>
+                <w:sz w:val="17"/>
               </w:rPr>
-              <w:t>Pedido concreto:  1) Cerrar y asegurar la llave de emergencia.  2) Ajustar la automatización de bomba para que no anule el corte WES.  3) Permitir reactivar WES en horario 23:00–06:00 y verificar la misma noche que 01:00–05:00 vuelvan a ≈ 0 m³/h.</w:t>
+              <w:t>Pedido concreto: 1) Cerrar y asegurar la llave de emergencia.  2) Ajustar la automatización para que no anule el corte WES.  3) Reactivar WES 23:00–06:00 y verificar la misma noche que 01:00–05:00 vuelvan a ≈ 0 m³/h.</w:t>
             </w:r>
           </w:p>
         </w:tc>
@@ -606,7 +791,7 @@
     </w:tbl>
     <w:p>
       <w:pPr>
-        <w:spacing w:after="0" w:before="100" w:line="259" w:lineRule="auto"/>
+        <w:spacing w:after="0" w:before="80" w:line="259" w:lineRule="auto"/>
         <w:jc w:val="center"/>
       </w:pPr>
       <w:r>
@@ -617,13 +802,13 @@
           <w:color w:val="4B5563"/>
           <w:sz w:val="14"/>
         </w:rPr>
-        <w:t>WES Chile  ·  Fuente: serie horaria API nodo 000006-04  ·  Julio 2026 (sala de bomba operativa): 5.006 m³</w:t>
+        <w:t>WES Chile  ·  Fuente: API nodo 000006-04  ·  Julio 2026 (sala de bomba operativa): 5.006 m³</w:t>
       </w:r>
     </w:p>
     <w:sectPr>
       <w:headerReference w:type="default" r:id="rId9"/>
       <w:pgSz w:w="12240" w:h="15840"/>
-      <w:pgMar w:top="595" w:right="822" w:bottom="510" w:left="822" w:header="720" w:footer="720" w:gutter="0"/>
+      <w:pgMar w:top="567" w:right="794" w:bottom="482" w:left="794" w:header="720" w:footer="720" w:gutter="0"/>
       <w:cols w:space="720"/>
       <w:docGrid w:linePitch="360"/>
     </w:sectPr>

</xml_diff>